<commit_message>
Whatever is on Arch
</commit_message>
<xml_diff>
--- a/Resume (Home Care Delivered).docx
+++ b/Resume (Home Care Delivered).docx
@@ -113,22 +113,159 @@
           <w:b/>
           <w:bCs/>
         </w:rPr>
-        <w:t>Stony Brook University</w:t>
-        <w:tab/>
-        <w:tab/>
-        <w:tab/>
-        <w:tab/>
-        <w:tab/>
-        <w:tab/>
-        <w:tab/>
-        <w:t xml:space="preserve">  </w:t>
-      </w:r>
+        <w:t>Degrees</w:t>
+      </w:r>
+    </w:p>
+    <w:p>
+      <w:pPr>
+        <w:pStyle w:val="Normal"/>
+        <w:spacing w:lineRule="auto" w:line="240" w:before="0" w:after="48"/>
+        <w:contextualSpacing/>
+        <w:rPr>
+          <w:b/>
+          <w:bCs/>
+        </w:rPr>
+      </w:pPr>
+      <w:r>
+        <w:rPr>
+          <w:b/>
+          <w:bCs/>
+        </w:rPr>
+        <w:t xml:space="preserve">Stony Brook </w:t>
+      </w:r>
+      <w:r>
+        <w:rPr>
+          <w:b/>
+          <w:bCs/>
+        </w:rPr>
+        <w:t>University</w:t>
+      </w:r>
+    </w:p>
+    <w:p>
+      <w:pPr>
+        <w:pStyle w:val="Normal"/>
+        <w:spacing w:lineRule="auto" w:line="240" w:before="0" w:after="48"/>
+        <w:contextualSpacing/>
+        <w:rPr>
+          <w:b/>
+          <w:bCs/>
+        </w:rPr>
+      </w:pPr>
+      <w:r>
+        <w:rPr>
+          <w:b w:val="false"/>
+          <w:bCs w:val="false"/>
+        </w:rPr>
+        <w:t>Major: Computer Science B.S</w:t>
+      </w:r>
+    </w:p>
+    <w:p>
+      <w:pPr>
+        <w:pStyle w:val="Normal"/>
+        <w:spacing w:lineRule="auto" w:line="240" w:before="0" w:after="48"/>
+        <w:contextualSpacing/>
+        <w:rPr>
+          <w:b/>
+          <w:bCs/>
+        </w:rPr>
+      </w:pPr>
       <w:r>
         <w:rPr>
           <w:i/>
           <w:iCs/>
         </w:rPr>
-        <w:t>Expected Gradation: May 2027</w:t>
+        <w:t>E</w:t>
+      </w:r>
+      <w:r>
+        <w:rPr>
+          <w:i/>
+          <w:iCs/>
+        </w:rPr>
+        <w:t xml:space="preserve">xpected </w:t>
+      </w:r>
+      <w:r>
+        <w:rPr>
+          <w:i/>
+          <w:iCs/>
+        </w:rPr>
+        <w:t>Gradation: May 2027</w:t>
+      </w:r>
+    </w:p>
+    <w:p>
+      <w:pPr>
+        <w:pStyle w:val="Normal"/>
+        <w:spacing w:lineRule="auto" w:line="240" w:before="0" w:after="48"/>
+        <w:contextualSpacing/>
+        <w:rPr>
+          <w:b/>
+          <w:bCs/>
+        </w:rPr>
+      </w:pPr>
+      <w:r>
+        <w:rPr>
+          <w:b/>
+          <w:bCs/>
+        </w:rPr>
+        <w:t xml:space="preserve">Stony Brook </w:t>
+      </w:r>
+      <w:r>
+        <w:rPr>
+          <w:b/>
+          <w:bCs/>
+        </w:rPr>
+        <w:t>University</w:t>
+      </w:r>
+    </w:p>
+    <w:p>
+      <w:pPr>
+        <w:pStyle w:val="Normal"/>
+        <w:spacing w:lineRule="auto" w:line="240" w:before="0" w:after="48"/>
+        <w:contextualSpacing/>
+        <w:rPr>
+          <w:b/>
+          <w:bCs/>
+          <w:u w:val="none"/>
+        </w:rPr>
+      </w:pPr>
+      <w:r>
+        <w:rPr>
+          <w:b w:val="false"/>
+          <w:bCs w:val="false"/>
+        </w:rPr>
+        <w:t>Major: Applied Math &amp; Statistics B.S</w:t>
+      </w:r>
+    </w:p>
+    <w:p>
+      <w:pPr>
+        <w:pStyle w:val="Normal"/>
+        <w:spacing w:lineRule="auto" w:line="240" w:before="0" w:after="48"/>
+        <w:contextualSpacing/>
+        <w:rPr>
+          <w:b/>
+          <w:bCs/>
+          <w:u w:val="none"/>
+        </w:rPr>
+      </w:pPr>
+      <w:r>
+        <w:rPr>
+          <w:i/>
+          <w:iCs/>
+        </w:rPr>
+        <w:t>Expected Grad</w:t>
+      </w:r>
+      <w:r>
+        <w:rPr>
+          <w:i/>
+          <w:iCs/>
+        </w:rPr>
+        <w:t>u</w:t>
+      </w:r>
+      <w:r>
+        <w:rPr>
+          <w:i/>
+          <w:iCs/>
+        </w:rPr>
+        <w:t>ation: May 2027</w:t>
       </w:r>
     </w:p>
     <w:p>
@@ -140,25 +277,17 @@
       </w:pPr>
       <w:r>
         <w:rPr>
-          <w:b/>
-          <w:bCs/>
-        </w:rPr>
-        <w:t>Major:</w:t>
-      </w:r>
-      <w:r>
-        <w:rPr/>
-        <w:t xml:space="preserve"> Computer Science + Applied Math &amp; Statistics (Data Science)</w:t>
-        <w:tab/>
-        <w:tab/>
-        <w:tab/>
-        <w:t xml:space="preserve">     </w:t>
-      </w:r>
-      <w:r>
-        <w:rPr>
           <w:i/>
           <w:iCs/>
         </w:rPr>
-        <w:t xml:space="preserve">GPA: </w:t>
+        <w:t>GPA</w:t>
+      </w:r>
+      <w:r>
+        <w:rPr>
+          <w:i/>
+          <w:iCs/>
+        </w:rPr>
+        <w:t xml:space="preserve">: </w:t>
       </w:r>
       <w:r>
         <w:rPr/>
@@ -222,7 +351,16 @@
           <w:sz w:val="28"/>
           <w:szCs w:val="28"/>
         </w:rPr>
-        <w:t>Research</w:t>
+        <w:t xml:space="preserve">Research </w:t>
+      </w:r>
+      <w:r>
+        <w:rPr>
+          <w:rFonts w:cs="Tahoma" w:ascii="Georgia" w:hAnsi="Georgia"/>
+          <w:color w:themeColor="text1" w:val="000000"/>
+          <w:sz w:val="28"/>
+          <w:szCs w:val="28"/>
+        </w:rPr>
+        <w:t>Experience</w:t>
       </w:r>
     </w:p>
     <w:p>
@@ -266,13 +404,30 @@
           <w:iCs/>
         </w:rPr>
         <w:t>Undergraduate Research Assistant</w:t>
-        <w:tab/>
-        <w:tab/>
-        <w:t xml:space="preserve">            </w:t>
-        <w:tab/>
-        <w:tab/>
-        <w:tab/>
-        <w:t xml:space="preserve">           Sep 2025 –Present</w:t>
+      </w:r>
+    </w:p>
+    <w:p>
+      <w:pPr>
+        <w:pStyle w:val="Normal"/>
+        <w:spacing w:lineRule="auto" w:line="240" w:before="0" w:after="48"/>
+        <w:rPr>
+          <w:i/>
+          <w:iCs/>
+        </w:rPr>
+      </w:pPr>
+      <w:r>
+        <w:rPr>
+          <w:i/>
+          <w:iCs/>
+        </w:rPr>
+        <w:t>Sep 2025 –</w:t>
+      </w:r>
+      <w:r>
+        <w:rPr>
+          <w:i/>
+          <w:iCs/>
+        </w:rPr>
+        <w:t>Jan 2026</w:t>
       </w:r>
     </w:p>
     <w:p>
@@ -316,7 +471,22 @@
           <w:i/>
           <w:iCs/>
         </w:rPr>
-        <w:t>Automated scammer behavior monitoring using Selenium and Python, generating test payment data to estimate potential financial damage and identify attack vectors.</w:t>
+        <w:t xml:space="preserve">Automated scammer behavior monitoring using Selenium and Python, generating test payment data to </w:t>
+      </w:r>
+      <w:r>
+        <w:rPr>
+          <w:i/>
+          <w:iCs/>
+          <w:u w:val="double"/>
+        </w:rPr>
+        <w:t>estimate</w:t>
+      </w:r>
+      <w:r>
+        <w:rPr>
+          <w:i/>
+          <w:iCs/>
+        </w:rPr>
+        <w:t xml:space="preserve"> potential financial damage and identify attack vectors.</w:t>
       </w:r>
     </w:p>
     <w:p>
@@ -376,11 +546,46 @@
           <w:i/>
           <w:iCs/>
         </w:rPr>
-        <w:t xml:space="preserve">Teaching Assistant – Data Structures &amp; Algorithms    </w:t>
-        <w:tab/>
-        <w:tab/>
-        <w:tab/>
-        <w:t xml:space="preserve">           Aug 2025 - Present</w:t>
+        <w:t xml:space="preserve">Teaching Assistant – Data </w:t>
+      </w:r>
+      <w:r>
+        <w:rPr>
+          <w:i/>
+          <w:iCs/>
+          <w:u w:val="double"/>
+        </w:rPr>
+        <w:t>Structures</w:t>
+      </w:r>
+      <w:r>
+        <w:rPr>
+          <w:i/>
+          <w:iCs/>
+        </w:rPr>
+        <w:t xml:space="preserve"> &amp; Algorithms</w:t>
+      </w:r>
+    </w:p>
+    <w:p>
+      <w:pPr>
+        <w:pStyle w:val="Normal"/>
+        <w:spacing w:lineRule="auto" w:line="240" w:before="0" w:after="48"/>
+        <w:rPr>
+          <w:i/>
+          <w:iCs/>
+        </w:rPr>
+      </w:pPr>
+      <w:r>
+        <w:rPr>
+          <w:i/>
+          <w:iCs/>
+        </w:rPr>
+        <w:t xml:space="preserve">Aug 2025 – </w:t>
+      </w:r>
+      <w:r>
+        <w:rPr>
+          <w:i/>
+          <w:iCs/>
+        </w:rPr>
+        <w:t>Dec 2026</w:t>
       </w:r>
     </w:p>
     <w:p>

</xml_diff>